<commit_message>
Clear uploaded reports after page refresh
</commit_message>
<xml_diff>
--- a/docs/Check-In_Route_Analytics_Dashboard_SOP.docx
+++ b/docs/Check-In_Route_Analytics_Dashboard_SOP.docx
@@ -892,7 +892,7 @@
         <w:spacing w:after="40"/>
       </w:pPr>
       <w:r>
-        <w:t>Open the deployed application in the same browser profile where its saved Check-In file and plans are maintained. Use the Download Dashboard SOP link in the page footer to retrieve the current published procedure.</w:t>
+        <w:t>Open the deployed application in the browser profile where your saved plans and manual actuals are maintained. Use the Download Dashboard SOP link in the page footer to retrieve the current published procedure.</w:t>
       </w:r>
     </w:p>
     <w:p>
@@ -901,7 +901,7 @@
         <w:spacing w:after="40"/>
       </w:pPr>
       <w:r>
-        <w:t>Upload the current Check-In / Check-Out workbook. The app parses it in the browser and saves the primary workbook in that browser when local IndexedDB is available. On a later visit, it attempts to reload that saved file automatically.</w:t>
+        <w:t>Upload the current Check-In / Check-Out workbook. The app parses it in the browser for the current page session only; refreshing or closing the page clears uploaded report data, so upload the workbook again when you return.</w:t>
       </w:r>
     </w:p>
     <w:p>
@@ -951,7 +951,7 @@
     </w:p>
     <w:p>
       <w:r>
-        <w:t>Browser storage is local to that browser/device. The Check-In workbook persists in IndexedDB when supported. Weekly plans, old/new retailer manual actuals, and appearance are stored in local browser storage. Attendance, Dealer Master, and the separate Secondary Sales file should be re-uploaded if they are not present after a browser restart.</w:t>
+        <w:t>Uploaded Check-In, Attendance, Dealer Master, and Secondary Sales files are session-only and are not retained after a page refresh or close. The app also clears any older persisted Check-In workbook from its previous storage version. Weekly plans, old/new retailer manual actuals, and appearance remain saved in local browser storage.</w:t>
       </w:r>
     </w:p>
     <w:p>
@@ -2752,7 +2752,7 @@
     </w:p>
     <w:p>
       <w:r>
-        <w:t>The app processes Excel/CSV in the browser. Check-In data is saved locally in the browser when supported. Route display uses map tiles and route calculation may send coordinates to the configured public routing service; workbook rows and employee names are not needed for that route request. Routing availability can affect whether distance is road-based or estimated.</w:t>
+        <w:t>The app processes Excel/CSV in the browser. Uploaded report files remain in page memory only and are cleared on refresh or close; weekly plans, manual actuals, and appearance are saved locally. Route display uses map tiles and route calculation may send coordinates to the configured public routing service; workbook rows and employee names are not needed for that route request. Routing availability can affect whether distance is road-based or estimated.</w:t>
       </w:r>
     </w:p>
     <w:p>

</xml_diff>

<commit_message>
Apply official CRM theme to dashboards
</commit_message>
<xml_diff>
--- a/docs/Check-In_Route_Analytics_Dashboard_SOP.docx
+++ b/docs/Check-In_Route_Analytics_Dashboard_SOP.docx
@@ -285,6 +285,11 @@
     <w:p>
       <w:r>
         <w:t>Read this SOP as a guide to the current app. Calculated values come from the workbook loaded in that browser; manual plans and selected manual actuals are separate inputs. The same word, such as “Q1” or “unique,” can mean different things in separate dashboards, so use the report name and scope shown in each section.</w:t>
+      </w:r>
+    </w:p>
+    <w:p>
+      <w:r>
+        <w:t>The current light theme follows the official CRM reference: a deep navy vertical navigation rail, compact white content cards, royal-blue active navigation and primary actions, with green reserved for secondary-sales accents. Use Appearance to switch Light, Dark, or System mode; the selection is retained in this browser.</w:t>
       </w:r>
     </w:p>
     <w:p>

</xml_diff>

<commit_message>
Remove extra report scopes and uploader
</commit_message>
<xml_diff>
--- a/docs/Check-In_Route_Analytics_Dashboard_SOP.docx
+++ b/docs/Check-In_Route_Analytics_Dashboard_SOP.docx
@@ -126,7 +126,7 @@
                 <w:color w:val="26384A"/>
                 <w:sz w:val="16"/>
               </w:rPr>
-              <w:t>1.0 · 23 October 2026</w:t>
+              <w:t>1.1 · 23 October 2026</w:t>
             </w:r>
           </w:p>
         </w:tc>
@@ -711,7 +711,7 @@
                 <w:color w:val="26384A"/>
                 <w:sz w:val="16"/>
               </w:rPr>
-              <w:t>Dedicated Manager + Territory Q1 visit-day report, Q2 unique Channel Partner report, and Q2 weekly distributor-group validation panel.</w:t>
+              <w:t>Dedicated Manager + Territory Q1 visit-day report and Q2 unique Channel Partner report.</w:t>
             </w:r>
           </w:p>
         </w:tc>
@@ -781,7 +781,7 @@
                 <w:color w:val="26384A"/>
                 <w:sz w:val="16"/>
               </w:rPr>
-              <w:t>Weekly plan versus actual rows, editable plans, manual retailer actuals, and Secondary Sales workbook uploader/audit.</w:t>
+              <w:t>Weekly plan versus actual rows, editable plans, and manual retailer actuals.</w:t>
             </w:r>
           </w:p>
         </w:tc>
@@ -803,7 +803,7 @@
                 <w:color w:val="26384A"/>
                 <w:sz w:val="16"/>
               </w:rPr>
-              <w:t>Check-In workbook; Secondary Sales workbook for its own parsed report panel.</w:t>
+              <w:t>Check-In workbook.</w:t>
             </w:r>
           </w:p>
         </w:tc>
@@ -924,7 +924,7 @@
         <w:spacing w:after="40"/>
       </w:pPr>
       <w:r>
-        <w:t>For Weekly Sales Performance, use the Secondary Sales Report uploader only when you need that separate secondary-order report panel. The workbook requires a Basic order value/Basic Amount field and a date field; Date Created is preferred for weekly bucketing.</w:t>
+        <w:t>Weekly Sales Performance order count and amount use Check-In rows only; there is no separate Secondary Sales uploader in the dashboard.</w:t>
       </w:r>
     </w:p>
     <w:p>
@@ -956,7 +956,7 @@
     </w:p>
     <w:p>
       <w:r>
-        <w:t>Uploaded Check-In, Attendance, Dealer Master, and Secondary Sales files are session-only and are not retained after a page refresh or close. The app also clears any older persisted Check-In workbook from its previous storage version. Weekly plans, old/new retailer manual actuals, and appearance remain saved in local browser storage.</w:t>
+        <w:t>Uploaded Check-In, Attendance, and Dealer Master files are session-only and are not retained after a page refresh or close. The app also clears any older persisted Check-In workbook from its previous storage version. Weekly plans, old/new retailer manual actuals, and appearance remain saved in local browser storage.</w:t>
       </w:r>
     </w:p>
     <w:p>
@@ -1246,74 +1246,6 @@
           </w:p>
         </w:tc>
       </w:tr>
-      <w:tr>
-        <w:trPr>
-          <w:cantSplit/>
-        </w:trPr>
-        <w:tc>
-          <w:tcPr>
-            <w:tcW w:type="dxa" w:w="2174"/>
-            <w:vAlign w:val="center"/>
-          </w:tcPr>
-          <w:p>
-            <w:pPr>
-              <w:spacing w:after="0" w:before="0"/>
-            </w:pPr>
-            <w:r/>
-            <w:r>
-              <w:rPr>
-                <w:rFonts w:ascii="Aptos" w:hAnsi="Aptos"/>
-                <w:b w:val="0"/>
-                <w:color w:val="26384A"/>
-                <w:sz w:val="16"/>
-              </w:rPr>
-              <w:t>Q2 weekly distributor-group audit</w:t>
-            </w:r>
-          </w:p>
-        </w:tc>
-        <w:tc>
-          <w:tcPr>
-            <w:tcW w:type="dxa" w:w="3262"/>
-            <w:vAlign w:val="center"/>
-          </w:tcPr>
-          <w:p>
-            <w:pPr>
-              <w:spacing w:after="0" w:before="0"/>
-            </w:pPr>
-            <w:r/>
-            <w:r>
-              <w:rPr>
-                <w:rFonts w:ascii="Aptos" w:hAnsi="Aptos"/>
-                <w:b w:val="0"/>
-                <w:color w:val="26384A"/>
-                <w:sz w:val="16"/>
-              </w:rPr>
-              <w:t>Uses the Joint Working buckets above.</w:t>
-            </w:r>
-          </w:p>
-        </w:tc>
-        <w:tc>
-          <w:tcPr>
-            <w:tcW w:type="dxa" w:w="3564"/>
-            <w:vAlign w:val="center"/>
-          </w:tcPr>
-          <w:p>
-            <w:pPr>
-              <w:spacing w:after="0" w:before="0"/>
-            </w:pPr>
-            <w:r/>
-            <w:r>
-              <w:rPr>
-                <w:rFonts w:ascii="Aptos" w:hAnsi="Aptos"/>
-                <w:b w:val="0"/>
-                <w:color w:val="26384A"/>
-                <w:sz w:val="16"/>
-              </w:rPr>
-              <w:t>The panel also exposes a day-15 boundary check for the 8–15 week.</w:t>
-            </w:r>
-          </w:p>
-        </w:tc>
-      </w:tr>
     </w:tbl>
     <w:p>
       <w:pPr>
@@ -1594,7 +1526,7 @@
     </w:p>
     <w:p>
       <w:r>
-        <w:t>This report family has its own configuration. It is distinct from the Manager-only KPI, even where labels look similar. The tab currently contains the Manager + Territory Q1/Q2 report and a separate reference-pivot Q2 weekly distributor-group audit.</w:t>
+        <w:t>This report family has its own configuration, separate from the Manager-only KPI. The tab contains the dedicated Manager + Territory Q1 visit-day report and Q2 unique Channel Partner report. The original Manager-only Joint Working KPI remains on its own tab; its additional Manager-only table and the separate Q2 reference-pivot validation are not shown in this report view.</w:t>
       </w:r>
     </w:p>
     <w:p>
@@ -1662,7 +1594,7 @@
         <w:keepNext/>
       </w:pPr>
       <w:r>
-        <w:t>6.2 Q2 · Unique Channel Partners of Managers</w:t>
+        <w:t>6.2 Q2 · Unique Channel Partners</w:t>
       </w:r>
     </w:p>
     <w:p>
@@ -1671,7 +1603,7 @@
         <w:spacing w:after="40"/>
       </w:pPr>
       <w:r>
-        <w:t>Uses the dedicated Manager-only Q1 configuration, not the Manager + Territory list: approved Manager Sales User designation, Type CHANNEL PARTNER, and a usable distributor identifier. Joint Working = YES is not required.</w:t>
+        <w:t>Uses the configured Q3 Senior designation list (Appendix A5), Type CHANNEL PARTNER, and a usable distributor identifier. Joint Working = YES is not required.</w:t>
       </w:r>
     </w:p>
     <w:p>
@@ -1690,25 +1622,6 @@
       </w:pPr>
       <w:r>
         <w:t>Identifier priority: Dealer Channel Partner Code, then Dealer Channel Partner, then Company Name. Repeated source rows map to one weekly distributor. Audit data shows identifier source and contributing source rows.</w:t>
-      </w:r>
-    </w:p>
-    <w:p>
-      <w:pPr>
-        <w:pStyle w:val="Heading2"/>
-        <w:keepNext/>
-      </w:pPr>
-      <w:r>
-        <w:t>6.3 Q2 weekly distributor groups reference audit</w:t>
-      </w:r>
-    </w:p>
-    <w:p>
-      <w:r>
-        <w:t>A second Q2 validation panel reproduces a reference pivot using its own designation list. It filters Type = CHANNEL PARTNER and excludes the four configured Zonal Manager values. The counted grouping key is Senior Sales User + Designation + normalized Distributor Identifier + Type, within a week. Thus the same distributor can form separate groups for different senior users or designations; this is not the global-unique rule used by section 6.2.</w:t>
-      </w:r>
-    </w:p>
-    <w:p>
-      <w:r>
-        <w:t>The panel reports raw weekly rows, rows passing eligibility, blank identifiers, missing senior identity, removed duplicates, unique groups, repeated-group examples, designation/type breakdowns, day-15 boundary analysis, and source-row inclusion/exclusion reasons. It may display “expected pending” or “source data missing” when its reference values or required headers are unavailable.</w:t>
       </w:r>
     </w:p>
     <w:p>
@@ -2179,7 +2092,7 @@
     </w:p>
     <w:p>
       <w:r>
-        <w:t>The separate Secondary Sales workbook uploader is not the current formula source for these Check-In-based order actuals. It parses its own workbook for its report/audit panel. That workbook must contain Basic order value (Excel column V; legacy Basic Amount accepted) and a date column; Date Created is the preferred date field. Do not substitute its amounts into the Weekly Sales Performance actuals unless the business rule is explicitly changed.</w:t>
+        <w:t>Weekly order count and amount are calculated from the Check-In report only, using Joint Working and Secondary sales fields. The dashboard no longer includes a separate Secondary Sales workbook uploader; Basic Order Value and secondary order evidence in the Check-In source continue to drive these actuals.</w:t>
       </w:r>
     </w:p>
     <w:p>
@@ -2678,77 +2591,6 @@
           </w:p>
         </w:tc>
       </w:tr>
-      <w:tr>
-        <w:trPr>
-          <w:cantSplit/>
-        </w:trPr>
-        <w:tc>
-          <w:tcPr>
-            <w:tcW w:type="dxa" w:w="1993"/>
-            <w:vAlign w:val="center"/>
-            <w:shd w:fill="F1F6FA"/>
-          </w:tcPr>
-          <w:p>
-            <w:pPr>
-              <w:spacing w:after="0" w:before="0"/>
-            </w:pPr>
-            <w:r/>
-            <w:r>
-              <w:rPr>
-                <w:rFonts w:ascii="Aptos" w:hAnsi="Aptos"/>
-                <w:b w:val="0"/>
-                <w:color w:val="26384A"/>
-                <w:sz w:val="16"/>
-              </w:rPr>
-              <w:t>Secondary Sales Report</w:t>
-            </w:r>
-          </w:p>
-        </w:tc>
-        <w:tc>
-          <w:tcPr>
-            <w:tcW w:type="dxa" w:w="3020"/>
-            <w:vAlign w:val="center"/>
-            <w:shd w:fill="F1F6FA"/>
-          </w:tcPr>
-          <w:p>
-            <w:pPr>
-              <w:spacing w:after="0" w:before="0"/>
-            </w:pPr>
-            <w:r/>
-            <w:r>
-              <w:rPr>
-                <w:rFonts w:ascii="Aptos" w:hAnsi="Aptos"/>
-                <w:b w:val="0"/>
-                <w:color w:val="26384A"/>
-                <w:sz w:val="16"/>
-              </w:rPr>
-              <w:t>Separate order workbook panel/audit in Weekly Sales Performance.</w:t>
-            </w:r>
-          </w:p>
-        </w:tc>
-        <w:tc>
-          <w:tcPr>
-            <w:tcW w:type="dxa" w:w="3987"/>
-            <w:vAlign w:val="center"/>
-            <w:shd w:fill="F1F6FA"/>
-          </w:tcPr>
-          <w:p>
-            <w:pPr>
-              <w:spacing w:after="0" w:before="0"/>
-            </w:pPr>
-            <w:r/>
-            <w:r>
-              <w:rPr>
-                <w:rFonts w:ascii="Aptos" w:hAnsi="Aptos"/>
-                <w:b w:val="0"/>
-                <w:color w:val="26384A"/>
-                <w:sz w:val="16"/>
-              </w:rPr>
-              <w:t>Basic order value / Basic Amount and Date Created or another recognized date header are required. Date Created is used first when present.</w:t>
-            </w:r>
-          </w:p>
-        </w:tc>
-      </w:tr>
     </w:tbl>
     <w:p>
       <w:pPr>
@@ -2820,7 +2662,7 @@
         <w:spacing w:after="60"/>
       </w:pPr>
       <w:r>
-        <w:t>For unique calculations, review the displayed grouping key and scope: Manager + date (Q1), global distributor by week (selected Q2), or Senior + designation + distributor + type group (reference Q2 audit).</w:t>
+        <w:t>For unique calculations, review the displayed grouping key and scope: Manager + date (Q1) or global distributor by week (Q2).</w:t>
       </w:r>
     </w:p>
     <w:p>
@@ -2931,26 +2773,7 @@
         <w:keepNext/>
       </w:pPr>
       <w:r>
-        <w:t>A6. Q2 weekly distributor reference audit list</w:t>
-      </w:r>
-    </w:p>
-    <w:p>
-      <w:r>
-        <w:t>AGM-SALES; ASSISTANT MANAGER-SALES; ASSISTANT MANAGER-SALES (4); ASSISTANT MANAGER-SALES (NBD) (4); DEPUTY MANAGER-SALES; DEPUTY MANAGER-SALES (4); DGM-SALES; MANAGER-SALES; MANAGER-SALES (4); SR.MANAGER-SALES (9); TERRITORY SALES INCHARGE; TERRITORY SALES MANAGER; TERRITORY SALES MANAGER (4); TERRITORY SALES OFFICER; TERRITORY SALES OFFICER (4).</w:t>
-      </w:r>
-    </w:p>
-    <w:p>
-      <w:r>
-        <w:t>The current source list for this reference audit is report-specific and may not contain every designation present in the general Manager + Territory list.</w:t>
-      </w:r>
-    </w:p>
-    <w:p>
-      <w:pPr>
-        <w:pStyle w:val="Heading2"/>
-        <w:keepNext/>
-      </w:pPr>
-      <w:r>
-        <w:t>A7. Zonal Managers excluded from the reports that specify exclusions</w:t>
+        <w:t>A6. Zonal Managers excluded from the reports that specify exclusions</w:t>
       </w:r>
     </w:p>
     <w:p>
@@ -3295,7 +3118,7 @@
                 <w:color w:val="26384A"/>
                 <w:sz w:val="16"/>
               </w:rPr>
-              <w:t>Q2 pivot audit</w:t>
+              <w:t>Weekly SSP</w:t>
             </w:r>
           </w:p>
         </w:tc>
@@ -3304,53 +3127,6 @@
             <w:tcW w:type="dxa" w:w="6946"/>
             <w:vAlign w:val="center"/>
             <w:shd w:fill="F1F6FA"/>
-          </w:tcPr>
-          <w:p>
-            <w:pPr>
-              <w:spacing w:after="0" w:before="0"/>
-            </w:pPr>
-            <w:r/>
-            <w:r>
-              <w:rPr>
-                <w:rFonts w:ascii="Aptos" w:hAnsi="Aptos"/>
-                <w:b w:val="0"/>
-                <w:color w:val="26384A"/>
-                <w:sz w:val="16"/>
-              </w:rPr>
-              <w:t>Count(distinct Senior + designation + distributor identifier + Type) group per week.</w:t>
-            </w:r>
-          </w:p>
-        </w:tc>
-      </w:tr>
-      <w:tr>
-        <w:trPr>
-          <w:cantSplit/>
-        </w:trPr>
-        <w:tc>
-          <w:tcPr>
-            <w:tcW w:type="dxa" w:w="2054"/>
-            <w:vAlign w:val="center"/>
-          </w:tcPr>
-          <w:p>
-            <w:pPr>
-              <w:spacing w:after="0" w:before="0"/>
-            </w:pPr>
-            <w:r/>
-            <w:r>
-              <w:rPr>
-                <w:rFonts w:ascii="Aptos" w:hAnsi="Aptos"/>
-                <w:b w:val="0"/>
-                <w:color w:val="26384A"/>
-                <w:sz w:val="16"/>
-              </w:rPr>
-              <w:t>Weekly SSP</w:t>
-            </w:r>
-          </w:p>
-        </w:tc>
-        <w:tc>
-          <w:tcPr>
-            <w:tcW w:type="dxa" w:w="6946"/>
-            <w:vAlign w:val="center"/>
           </w:tcPr>
           <w:p>
             <w:pPr>
@@ -3377,7 +3153,6 @@
           <w:tcPr>
             <w:tcW w:type="dxa" w:w="2054"/>
             <w:vAlign w:val="center"/>
-            <w:shd w:fill="F1F6FA"/>
           </w:tcPr>
           <w:p>
             <w:pPr>
@@ -3399,7 +3174,6 @@
           <w:tcPr>
             <w:tcW w:type="dxa" w:w="6946"/>
             <w:vAlign w:val="center"/>
-            <w:shd w:fill="F1F6FA"/>
           </w:tcPr>
           <w:p>
             <w:pPr>
@@ -3426,6 +3200,7 @@
           <w:tcPr>
             <w:tcW w:type="dxa" w:w="2054"/>
             <w:vAlign w:val="center"/>
+            <w:shd w:fill="F1F6FA"/>
           </w:tcPr>
           <w:p>
             <w:pPr>
@@ -3447,6 +3222,7 @@
           <w:tcPr>
             <w:tcW w:type="dxa" w:w="6946"/>
             <w:vAlign w:val="center"/>
+            <w:shd w:fill="F1F6FA"/>
           </w:tcPr>
           <w:p>
             <w:pPr>
@@ -3473,7 +3249,6 @@
           <w:tcPr>
             <w:tcW w:type="dxa" w:w="2054"/>
             <w:vAlign w:val="center"/>
-            <w:shd w:fill="F1F6FA"/>
           </w:tcPr>
           <w:p>
             <w:pPr>
@@ -3495,7 +3270,6 @@
           <w:tcPr>
             <w:tcW w:type="dxa" w:w="6946"/>
             <w:vAlign w:val="center"/>
-            <w:shd w:fill="F1F6FA"/>
           </w:tcPr>
           <w:p>
             <w:pPr>
@@ -3522,6 +3296,7 @@
           <w:tcPr>
             <w:tcW w:type="dxa" w:w="2054"/>
             <w:vAlign w:val="center"/>
+            <w:shd w:fill="F1F6FA"/>
           </w:tcPr>
           <w:p>
             <w:pPr>
@@ -3543,6 +3318,7 @@
           <w:tcPr>
             <w:tcW w:type="dxa" w:w="6946"/>
             <w:vAlign w:val="center"/>
+            <w:shd w:fill="F1F6FA"/>
           </w:tcPr>
           <w:p>
             <w:pPr>

</xml_diff>

<commit_message>
Add tab-scoped welcome screen
</commit_message>
<xml_diff>
--- a/docs/Check-In_Route_Analytics_Dashboard_SOP.docx
+++ b/docs/Check-In_Route_Analytics_Dashboard_SOP.docx
@@ -126,7 +126,7 @@
                 <w:color w:val="26384A"/>
                 <w:sz w:val="16"/>
               </w:rPr>
-              <w:t>1.1 · 23 October 2026</w:t>
+              <w:t>1.2 · 23 October 2026</w:t>
             </w:r>
           </w:p>
         </w:tc>
@@ -897,7 +897,16 @@
         <w:spacing w:after="40"/>
       </w:pPr>
       <w:r>
-        <w:t>Open the deployed application in the browser profile where your saved plans and manual actuals are maintained. Use the Download Dashboard SOP link in the page footer to retrieve the current published procedure.</w:t>
+        <w:t>Open the deployed application. A new browser tab shows the branded welcome image. Click Login to enter the dashboard; the welcome screen remains dismissed on refresh in that same tab and appears again when a new tab is opened after closing it. This is a start screen, not a credential check.</w:t>
+      </w:r>
+    </w:p>
+    <w:p>
+      <w:pPr>
+        <w:pStyle w:val="ListBullet"/>
+        <w:spacing w:after="40"/>
+      </w:pPr>
+      <w:r>
+        <w:t>Use the Download Dashboard SOP link in the page footer to retrieve the current published procedure.</w:t>
       </w:r>
     </w:p>
     <w:p>
@@ -955,6 +964,29 @@
       </w:r>
     </w:p>
     <w:p>
+      <w:pPr>
+        <w:pStyle w:val="Heading1"/>
+        <w:keepNext/>
+      </w:pPr>
+      <w:r>
+        <w:t>3. Welcome screen and tab behavior</w:t>
+      </w:r>
+    </w:p>
+    <w:p>
+      <w:r>
+        <w:t>Each new browser tab starts on a branded welcome screen using the Check-In Route Analytics artwork. Login opens the dashboard and records dismissal in that tab’s sessionStorage. Refreshing the same tab keeps the dashboard open; closing the tab ends that session, so a newly opened tab shows the welcome screen again. The Login button is a navigation/start control and does not verify credentials.</w:t>
+      </w:r>
+    </w:p>
+    <w:p>
+      <w:pPr>
+        <w:pStyle w:val="Heading1"/>
+        <w:keepNext/>
+      </w:pPr>
+      <w:r>
+        <w:t>4. Uploaded data and saved settings</w:t>
+      </w:r>
+    </w:p>
+    <w:p>
       <w:r>
         <w:t>Uploaded Check-In, Attendance, and Dealer Master files are session-only and are not retained after a page refresh or close. The app also clears any older persisted Check-In workbook from its previous storage version. Weekly plans, old/new retailer manual actuals, and appearance remain saved in local browser storage.</w:t>
       </w:r>
@@ -965,7 +997,7 @@
         <w:keepNext/>
       </w:pPr>
       <w:r>
-        <w:t>3. Common data preparation and date handling</w:t>
+        <w:t>5. Common data preparation and date handling</w:t>
       </w:r>
     </w:p>
     <w:p>
@@ -1019,7 +1051,7 @@
         <w:keepNext/>
       </w:pPr>
       <w:r>
-        <w:t>4. Calendar buckets by report</w:t>
+        <w:t>6. Calendar buckets by report</w:t>
       </w:r>
     </w:p>
     <w:tbl>
@@ -1263,7 +1295,7 @@
         <w:keepNext/>
       </w:pPr>
       <w:r>
-        <w:t>5. Joint Working KPI tab</w:t>
+        <w:t>7. Joint Working KPI tab</w:t>
       </w:r>
     </w:p>
     <w:p>
@@ -1277,7 +1309,7 @@
         <w:keepNext/>
       </w:pPr>
       <w:r>
-        <w:t>5.1 Original Manager-only KPI</w:t>
+        <w:t>7.1 Original Manager-only KPI</w:t>
       </w:r>
     </w:p>
     <w:p>
@@ -1507,7 +1539,7 @@
         <w:keepNext/>
       </w:pPr>
       <w:r>
-        <w:t>5.2 Manager + Territory copy</w:t>
+        <w:t>7.2 Manager + Territory copy</w:t>
       </w:r>
     </w:p>
     <w:p>
@@ -1521,7 +1553,7 @@
         <w:keepNext/>
       </w:pPr>
       <w:r>
-        <w:t>6. Q1–Q2 Reports tab</w:t>
+        <w:t>8. Q1–Q2 Reports tab</w:t>
       </w:r>
     </w:p>
     <w:p>
@@ -1535,7 +1567,7 @@
         <w:keepNext/>
       </w:pPr>
       <w:r>
-        <w:t>6.1 Q1 · Manager joint working with eligible Executive / BDO</w:t>
+        <w:t>8.1 Q1 · Manager joint working with eligible Executive / BDO</w:t>
       </w:r>
     </w:p>
     <w:p>
@@ -1594,7 +1626,7 @@
         <w:keepNext/>
       </w:pPr>
       <w:r>
-        <w:t>6.2 Q2 · Unique Channel Partners</w:t>
+        <w:t>8.2 Q2 · Unique Channel Partners</w:t>
       </w:r>
     </w:p>
     <w:p>
@@ -1630,7 +1662,7 @@
         <w:keepNext/>
       </w:pPr>
       <w:r>
-        <w:t>7. Weekly Sales Performance</w:t>
+        <w:t>9. Weekly Sales Performance</w:t>
       </w:r>
     </w:p>
     <w:p>
@@ -2106,7 +2138,7 @@
         <w:keepNext/>
       </w:pPr>
       <w:r>
-        <w:t>8. Dashboard</w:t>
+        <w:t>10. Dashboard</w:t>
       </w:r>
     </w:p>
     <w:p>
@@ -2169,7 +2201,7 @@
         <w:keepNext/>
       </w:pPr>
       <w:r>
-        <w:t>9. Tour Plan</w:t>
+        <w:t>11. Tour Plan</w:t>
       </w:r>
     </w:p>
     <w:p>
@@ -2223,7 +2255,7 @@
         <w:keepNext/>
       </w:pPr>
       <w:r>
-        <w:t>10. Check-in Analysis</w:t>
+        <w:t>12. Check-in Analysis</w:t>
       </w:r>
     </w:p>
     <w:p>
@@ -2242,7 +2274,7 @@
         <w:keepNext/>
       </w:pPr>
       <w:r>
-        <w:t>11. Employee Tour Plan</w:t>
+        <w:t>13. Employee Tour Plan</w:t>
       </w:r>
     </w:p>
     <w:p>
@@ -2296,7 +2328,7 @@
         <w:keepNext/>
       </w:pPr>
       <w:r>
-        <w:t>12. Inputs, storage, and interpretation</w:t>
+        <w:t>14. Inputs, storage, and interpretation</w:t>
       </w:r>
     </w:p>
     <w:tbl>
@@ -2608,7 +2640,7 @@
         <w:keepNext/>
       </w:pPr>
       <w:r>
-        <w:t>13. Reconciliation checklist</w:t>
+        <w:t>15. Reconciliation checklist</w:t>
       </w:r>
     </w:p>
     <w:p>
@@ -2764,21 +2796,7 @@
     </w:p>
     <w:p>
       <w:r>
-        <w:t>DEPUTY MANAGER-SALES; DEPUTY MANAGER-SALES (4); MANAGER-SALES; MANAGER-SALES (4); ASSISTANT MANAGER-SALES; ASSISTANT MANAGER-SALES (4); ASSISTANT MANAGER-SALES (NBD) (4); AGM-SALES; SR.MANAGER-SALES (9); DGM-SALES.</w:t>
-      </w:r>
-    </w:p>
-    <w:p>
-      <w:pPr>
-        <w:pStyle w:val="Heading2"/>
-        <w:keepNext/>
-      </w:pPr>
-      <w:r>
-        <w:t>A6. Zonal Managers excluded from the reports that specify exclusions</w:t>
-      </w:r>
-    </w:p>
-    <w:p>
-      <w:r>
-        <w:t>SHOBHIT GOEL; OTHERS; ARCHIT GARG; SHANTANU ATTARY.</w:t>
+        <w:t>DEPUTY MANAGER-SALES; DEPUTY MANAGER-SALES (4); MANAGER-SALES; MANAGER-SALES (4); ASSISTANT MANAGER-SALES; ASSISTANT MANAGER-SALES (4); ASSISTANT MANAGER-SALES (NBD) (4); AGM-SALES; SR.MANAGER-SALES (9); DGM-SALES. Reports specifying Zonal Manager exclusions also omit SHOBHIT GOEL; OTHERS; ARCHIT GARG; SHANTANU ATTARY.</w:t>
       </w:r>
     </w:p>
     <w:p>

</xml_diff>

<commit_message>
Fit welcome artwork and highlight login
</commit_message>
<xml_diff>
--- a/docs/Check-In_Route_Analytics_Dashboard_SOP.docx
+++ b/docs/Check-In_Route_Analytics_Dashboard_SOP.docx
@@ -126,7 +126,7 @@
                 <w:color w:val="26384A"/>
                 <w:sz w:val="16"/>
               </w:rPr>
-              <w:t>1.2 · 23 October 2026</w:t>
+              <w:t>1.3 · 23 October 2026</w:t>
             </w:r>
           </w:p>
         </w:tc>
@@ -974,7 +974,7 @@
     </w:p>
     <w:p>
       <w:r>
-        <w:t>Each new browser tab starts on a branded welcome screen using the Check-In Route Analytics artwork. Login opens the dashboard and records dismissal in that tab’s sessionStorage. Refreshing the same tab keeps the dashboard open; closing the tab ends that session, so a newly opened tab shows the welcome screen again. The Login button is a navigation/start control and does not verify credentials.</w:t>
+        <w:t>Each new browser tab starts on a branded welcome screen using the Check-In Route Analytics artwork, fitted in full without cropping. A prominent blue Login button sits above the screen midpoint. Login opens the dashboard and records dismissal in that tab’s sessionStorage. Refreshing the same tab keeps the dashboard open; closing the tab ends that session, so a newly opened tab shows the welcome screen again. The Login button is a navigation/start control and does not verify credentials.</w:t>
       </w:r>
     </w:p>
     <w:p>

</xml_diff>

<commit_message>
Add Check-In Check-Out report tab
</commit_message>
<xml_diff>
--- a/docs/Check-In_Route_Analytics_Dashboard_SOP.docx
+++ b/docs/Check-In_Route_Analytics_Dashboard_SOP.docx
@@ -126,7 +126,7 @@
                 <w:color w:val="26384A"/>
                 <w:sz w:val="16"/>
               </w:rPr>
-              <w:t>1.3 · 23 October 2026</w:t>
+              <w:t>1.4 · 24 October 2026</w:t>
             </w:r>
           </w:p>
         </w:tc>
@@ -829,6 +829,75 @@
                 <w:color w:val="26384A"/>
                 <w:sz w:val="16"/>
               </w:rPr>
+              <w:t>CHECKIN-OUT REPORT</w:t>
+            </w:r>
+          </w:p>
+        </w:tc>
+        <w:tc>
+          <w:tcPr>
+            <w:tcW w:type="dxa" w:w="3805"/>
+            <w:vAlign w:val="center"/>
+          </w:tcPr>
+          <w:p>
+            <w:pPr>
+              <w:spacing w:after="0" w:before="0"/>
+            </w:pPr>
+            <w:r/>
+            <w:r>
+              <w:rPr>
+                <w:rFonts w:ascii="Aptos" w:hAnsi="Aptos"/>
+                <w:b w:val="0"/>
+                <w:color w:val="26384A"/>
+                <w:sz w:val="16"/>
+              </w:rPr>
+              <w:t>Employee-day attendance and visit-category summary with filters and exports.</w:t>
+            </w:r>
+          </w:p>
+        </w:tc>
+        <w:tc>
+          <w:tcPr>
+            <w:tcW w:type="dxa" w:w="3322"/>
+            <w:vAlign w:val="center"/>
+          </w:tcPr>
+          <w:p>
+            <w:pPr>
+              <w:spacing w:after="0" w:before="0"/>
+            </w:pPr>
+            <w:r/>
+            <w:r>
+              <w:rPr>
+                <w:rFonts w:ascii="Aptos" w:hAnsi="Aptos"/>
+                <w:b w:val="0"/>
+                <w:color w:val="26384A"/>
+                <w:sz w:val="16"/>
+              </w:rPr>
+              <w:t>Existing Check-In workbook; orders and sales await a verified Secondary Orders source.</w:t>
+            </w:r>
+          </w:p>
+        </w:tc>
+      </w:tr>
+      <w:tr>
+        <w:trPr>
+          <w:cantSplit/>
+        </w:trPr>
+        <w:tc>
+          <w:tcPr>
+            <w:tcW w:type="dxa" w:w="1872"/>
+            <w:vAlign w:val="center"/>
+            <w:shd w:fill="F1F6FA"/>
+          </w:tcPr>
+          <w:p>
+            <w:pPr>
+              <w:spacing w:after="0" w:before="0"/>
+            </w:pPr>
+            <w:r/>
+            <w:r>
+              <w:rPr>
+                <w:rFonts w:ascii="Aptos" w:hAnsi="Aptos"/>
+                <w:b w:val="0"/>
+                <w:color w:val="26384A"/>
+                <w:sz w:val="16"/>
+              </w:rPr>
               <w:t>Employee Tour Plan</w:t>
             </w:r>
           </w:p>
@@ -837,6 +906,7 @@
           <w:tcPr>
             <w:tcW w:type="dxa" w:w="3805"/>
             <w:vAlign w:val="center"/>
+            <w:shd w:fill="F1F6FA"/>
           </w:tcPr>
           <w:p>
             <w:pPr>
@@ -858,6 +928,7 @@
           <w:tcPr>
             <w:tcW w:type="dxa" w:w="3322"/>
             <w:vAlign w:val="center"/>
+            <w:shd w:fill="F1F6FA"/>
           </w:tcPr>
           <w:p>
             <w:pPr>
@@ -934,6 +1005,15 @@
       </w:pPr>
       <w:r>
         <w:t>Weekly Sales Performance order count and amount use Check-In rows only; there is no separate Secondary Sales uploader in the dashboard.</w:t>
+      </w:r>
+    </w:p>
+    <w:p>
+      <w:pPr>
+        <w:pStyle w:val="ListBullet"/>
+        <w:spacing w:after="40"/>
+      </w:pPr>
+      <w:r>
+        <w:t>CHECKIN-OUT REPORT reuses the same Check-In upload. Its order count and sale remain pending until the separate Secondary Orders source is inspected and connected.</w:t>
       </w:r>
     </w:p>
     <w:p>
@@ -2328,7 +2408,621 @@
         <w:keepNext/>
       </w:pPr>
       <w:r>
-        <w:t>14. Inputs, storage, and interpretation</w:t>
+        <w:t>14. CHECKIN-OUT REPORT</w:t>
+      </w:r>
+    </w:p>
+    <w:p>
+      <w:r>
+        <w:t>This is a separate navigation tab and does not change the Q1–Q3 Reports Dashboard, Manager-only Joint Working KPI, or Weekly Sales Performance calculations. It reuses the currently loaded Check-In workbook and adds no mandatory upload.</w:t>
+      </w:r>
+    </w:p>
+    <w:tbl>
+      <w:tblPr>
+        <w:tblStyle w:val="TableGrid"/>
+        <w:tblW w:type="dxa" w:w="9000"/>
+        <w:jc w:val="center"/>
+        <w:tblLayout w:type="fixed"/>
+        <w:tblLook w:firstColumn="1" w:firstRow="1" w:lastColumn="0" w:lastRow="0" w:noHBand="0" w:noVBand="1" w:val="04A0"/>
+      </w:tblPr>
+      <w:tblGrid>
+        <w:gridCol w:w="2477"/>
+        <w:gridCol w:w="6523"/>
+      </w:tblGrid>
+      <w:tr>
+        <w:trPr>
+          <w:tblHeader w:val="true"/>
+          <w:cantSplit/>
+        </w:trPr>
+        <w:tc>
+          <w:tcPr>
+            <w:tcW w:type="dxa" w:w="4997"/>
+            <w:vAlign w:val="center"/>
+            <w:shd w:fill="176B87"/>
+          </w:tcPr>
+          <w:p>
+            <w:pPr>
+              <w:spacing w:after="0" w:before="0"/>
+            </w:pPr>
+            <w:r/>
+            <w:r>
+              <w:rPr>
+                <w:rFonts w:ascii="Aptos" w:hAnsi="Aptos"/>
+                <w:b/>
+                <w:color w:val="FFFFFF"/>
+                <w:sz w:val="16"/>
+              </w:rPr>
+              <w:t>Report field</w:t>
+            </w:r>
+          </w:p>
+        </w:tc>
+        <w:tc>
+          <w:tcPr>
+            <w:tcW w:type="dxa" w:w="4997"/>
+            <w:vAlign w:val="center"/>
+            <w:shd w:fill="176B87"/>
+          </w:tcPr>
+          <w:p>
+            <w:pPr>
+              <w:spacing w:after="0" w:before="0"/>
+            </w:pPr>
+            <w:r/>
+            <w:r>
+              <w:rPr>
+                <w:rFonts w:ascii="Aptos" w:hAnsi="Aptos"/>
+                <w:b/>
+                <w:color w:val="FFFFFF"/>
+                <w:sz w:val="16"/>
+              </w:rPr>
+              <w:t>Source mapping and calculation</w:t>
+            </w:r>
+          </w:p>
+        </w:tc>
+      </w:tr>
+      <w:tr>
+        <w:trPr>
+          <w:cantSplit/>
+        </w:trPr>
+        <w:tc>
+          <w:tcPr>
+            <w:tcW w:type="dxa" w:w="2477"/>
+            <w:vAlign w:val="center"/>
+          </w:tcPr>
+          <w:p>
+            <w:pPr>
+              <w:spacing w:after="0" w:before="0"/>
+            </w:pPr>
+            <w:r/>
+            <w:r>
+              <w:rPr>
+                <w:rFonts w:ascii="Aptos" w:hAnsi="Aptos"/>
+                <w:b w:val="0"/>
+                <w:color w:val="26384A"/>
+                <w:sz w:val="16"/>
+              </w:rPr>
+              <w:t>DATE / Month</w:t>
+            </w:r>
+          </w:p>
+        </w:tc>
+        <w:tc>
+          <w:tcPr>
+            <w:tcW w:type="dxa" w:w="6523"/>
+            <w:vAlign w:val="center"/>
+          </w:tcPr>
+          <w:p>
+            <w:pPr>
+              <w:spacing w:after="0" w:before="0"/>
+            </w:pPr>
+            <w:r/>
+            <w:r>
+              <w:rPr>
+                <w:rFonts w:ascii="Aptos" w:hAnsi="Aptos"/>
+                <w:b w:val="0"/>
+                <w:color w:val="26384A"/>
+                <w:sz w:val="16"/>
+              </w:rPr>
+              <w:t>Date; Month is derived from the parsed date.</w:t>
+            </w:r>
+          </w:p>
+        </w:tc>
+      </w:tr>
+      <w:tr>
+        <w:trPr>
+          <w:cantSplit/>
+        </w:trPr>
+        <w:tc>
+          <w:tcPr>
+            <w:tcW w:type="dxa" w:w="2477"/>
+            <w:vAlign w:val="center"/>
+            <w:shd w:fill="F1F6FA"/>
+          </w:tcPr>
+          <w:p>
+            <w:pPr>
+              <w:spacing w:after="0" w:before="0"/>
+            </w:pPr>
+            <w:r/>
+            <w:r>
+              <w:rPr>
+                <w:rFonts w:ascii="Aptos" w:hAnsi="Aptos"/>
+                <w:b w:val="0"/>
+                <w:color w:val="26384A"/>
+                <w:sz w:val="16"/>
+              </w:rPr>
+              <w:t>BDO NAME / STATE NAME</w:t>
+            </w:r>
+          </w:p>
+        </w:tc>
+        <w:tc>
+          <w:tcPr>
+            <w:tcW w:type="dxa" w:w="6523"/>
+            <w:vAlign w:val="center"/>
+            <w:shd w:fill="F1F6FA"/>
+          </w:tcPr>
+          <w:p>
+            <w:pPr>
+              <w:spacing w:after="0" w:before="0"/>
+            </w:pPr>
+            <w:r/>
+            <w:r>
+              <w:rPr>
+                <w:rFonts w:ascii="Aptos" w:hAnsi="Aptos"/>
+                <w:b w:val="0"/>
+                <w:color w:val="26384A"/>
+                <w:sz w:val="16"/>
+              </w:rPr>
+              <w:t>BDO NAME uses Sales User Name (or BDO Name). STATE NAME uses State Name or State. Missing columns display SOURCE DATA REQUIRED.</w:t>
+            </w:r>
+          </w:p>
+        </w:tc>
+      </w:tr>
+      <w:tr>
+        <w:trPr>
+          <w:cantSplit/>
+        </w:trPr>
+        <w:tc>
+          <w:tcPr>
+            <w:tcW w:type="dxa" w:w="2477"/>
+            <w:vAlign w:val="center"/>
+          </w:tcPr>
+          <w:p>
+            <w:pPr>
+              <w:spacing w:after="0" w:before="0"/>
+            </w:pPr>
+            <w:r/>
+            <w:r>
+              <w:rPr>
+                <w:rFonts w:ascii="Aptos" w:hAnsi="Aptos"/>
+                <w:b w:val="0"/>
+                <w:color w:val="26384A"/>
+                <w:sz w:val="16"/>
+              </w:rPr>
+              <w:t>CHECK IN TIME / CHECK OUT TIME</w:t>
+            </w:r>
+          </w:p>
+        </w:tc>
+        <w:tc>
+          <w:tcPr>
+            <w:tcW w:type="dxa" w:w="6523"/>
+            <w:vAlign w:val="center"/>
+          </w:tcPr>
+          <w:p>
+            <w:pPr>
+              <w:spacing w:after="0" w:before="0"/>
+            </w:pPr>
+            <w:r/>
+            <w:r>
+              <w:rPr>
+                <w:rFonts w:ascii="Aptos" w:hAnsi="Aptos"/>
+                <w:b w:val="0"/>
+                <w:color w:val="26384A"/>
+                <w:sz w:val="16"/>
+              </w:rPr>
+              <w:t>Check In / Check In Time and Check Out / Check Out Time. Employee-day displays the earliest valid check-in and latest valid check-out.</w:t>
+            </w:r>
+          </w:p>
+        </w:tc>
+      </w:tr>
+      <w:tr>
+        <w:trPr>
+          <w:cantSplit/>
+        </w:trPr>
+        <w:tc>
+          <w:tcPr>
+            <w:tcW w:type="dxa" w:w="2477"/>
+            <w:vAlign w:val="center"/>
+            <w:shd w:fill="F1F6FA"/>
+          </w:tcPr>
+          <w:p>
+            <w:pPr>
+              <w:spacing w:after="0" w:before="0"/>
+            </w:pPr>
+            <w:r/>
+            <w:r>
+              <w:rPr>
+                <w:rFonts w:ascii="Aptos" w:hAnsi="Aptos"/>
+                <w:b w:val="0"/>
+                <w:color w:val="26384A"/>
+                <w:sz w:val="16"/>
+              </w:rPr>
+              <w:t>TOTAL WORKING TIME</w:t>
+            </w:r>
+          </w:p>
+        </w:tc>
+        <w:tc>
+          <w:tcPr>
+            <w:tcW w:type="dxa" w:w="6523"/>
+            <w:vAlign w:val="center"/>
+            <w:shd w:fill="F1F6FA"/>
+          </w:tcPr>
+          <w:p>
+            <w:pPr>
+              <w:spacing w:after="0" w:before="0"/>
+            </w:pPr>
+            <w:r/>
+            <w:r>
+              <w:rPr>
+                <w:rFonts w:ascii="Aptos" w:hAnsi="Aptos"/>
+                <w:b w:val="0"/>
+                <w:color w:val="26384A"/>
+                <w:sz w:val="16"/>
+              </w:rPr>
+              <w:t>Elapsed span from earliest valid check-in to latest valid check-out for the employee-day; valid daily spans are summed. Average divides that total by employee-day rows with both valid timestamps and a nonnegative span no longer than 18 hours.</w:t>
+            </w:r>
+          </w:p>
+        </w:tc>
+      </w:tr>
+      <w:tr>
+        <w:trPr>
+          <w:cantSplit/>
+        </w:trPr>
+        <w:tc>
+          <w:tcPr>
+            <w:tcW w:type="dxa" w:w="2477"/>
+            <w:vAlign w:val="center"/>
+          </w:tcPr>
+          <w:p>
+            <w:pPr>
+              <w:spacing w:after="0" w:before="0"/>
+            </w:pPr>
+            <w:r/>
+            <w:r>
+              <w:rPr>
+                <w:rFonts w:ascii="Aptos" w:hAnsi="Aptos"/>
+                <w:b w:val="0"/>
+                <w:color w:val="26384A"/>
+                <w:sz w:val="16"/>
+              </w:rPr>
+              <w:t>COUNTER PLANNED</w:t>
+            </w:r>
+          </w:p>
+        </w:tc>
+        <w:tc>
+          <w:tcPr>
+            <w:tcW w:type="dxa" w:w="6523"/>
+            <w:vAlign w:val="center"/>
+          </w:tcPr>
+          <w:p>
+            <w:pPr>
+              <w:spacing w:after="0" w:before="0"/>
+            </w:pPr>
+            <w:r/>
+            <w:r>
+              <w:rPr>
+                <w:rFonts w:ascii="Aptos" w:hAnsi="Aptos"/>
+                <w:b w:val="0"/>
+                <w:color w:val="26384A"/>
+                <w:sz w:val="16"/>
+              </w:rPr>
+              <w:t>Counter Planned, Counters Planned, or Planned Counters. Conflicting or missing values remain unavailable.</w:t>
+            </w:r>
+          </w:p>
+        </w:tc>
+      </w:tr>
+      <w:tr>
+        <w:trPr>
+          <w:cantSplit/>
+        </w:trPr>
+        <w:tc>
+          <w:tcPr>
+            <w:tcW w:type="dxa" w:w="2477"/>
+            <w:vAlign w:val="center"/>
+            <w:shd w:fill="F1F6FA"/>
+          </w:tcPr>
+          <w:p>
+            <w:pPr>
+              <w:spacing w:after="0" w:before="0"/>
+            </w:pPr>
+            <w:r/>
+            <w:r>
+              <w:rPr>
+                <w:rFonts w:ascii="Aptos" w:hAnsi="Aptos"/>
+                <w:b w:val="0"/>
+                <w:color w:val="26384A"/>
+                <w:sz w:val="16"/>
+              </w:rPr>
+              <w:t>COUNTER VISITED</w:t>
+            </w:r>
+          </w:p>
+        </w:tc>
+        <w:tc>
+          <w:tcPr>
+            <w:tcW w:type="dxa" w:w="6523"/>
+            <w:vAlign w:val="center"/>
+            <w:shd w:fill="F1F6FA"/>
+          </w:tcPr>
+          <w:p>
+            <w:pPr>
+              <w:spacing w:after="0" w:before="0"/>
+            </w:pPr>
+            <w:r/>
+            <w:r>
+              <w:rPr>
+                <w:rFonts w:ascii="Aptos" w:hAnsi="Aptos"/>
+                <w:b w:val="0"/>
+                <w:color w:val="26384A"/>
+                <w:sz w:val="16"/>
+              </w:rPr>
+              <w:t>Distinct Type ID for Type DEALER + OTHER/OTHERS. Repeated IDs count once per employee-day. Missing Type ID values in qualifying rows make that subtotal unavailable.</w:t>
+            </w:r>
+          </w:p>
+        </w:tc>
+      </w:tr>
+      <w:tr>
+        <w:trPr>
+          <w:cantSplit/>
+        </w:trPr>
+        <w:tc>
+          <w:tcPr>
+            <w:tcW w:type="dxa" w:w="2477"/>
+            <w:vAlign w:val="center"/>
+          </w:tcPr>
+          <w:p>
+            <w:pPr>
+              <w:spacing w:after="0" w:before="0"/>
+            </w:pPr>
+            <w:r/>
+            <w:r>
+              <w:rPr>
+                <w:rFonts w:ascii="Aptos" w:hAnsi="Aptos"/>
+                <w:b w:val="0"/>
+                <w:color w:val="26384A"/>
+                <w:sz w:val="16"/>
+              </w:rPr>
+              <w:t>CP VISIT</w:t>
+            </w:r>
+          </w:p>
+        </w:tc>
+        <w:tc>
+          <w:tcPr>
+            <w:tcW w:type="dxa" w:w="6523"/>
+            <w:vAlign w:val="center"/>
+          </w:tcPr>
+          <w:p>
+            <w:pPr>
+              <w:spacing w:after="0" w:before="0"/>
+            </w:pPr>
+            <w:r/>
+            <w:r>
+              <w:rPr>
+                <w:rFonts w:ascii="Aptos" w:hAnsi="Aptos"/>
+                <w:b w:val="0"/>
+                <w:color w:val="26384A"/>
+                <w:sz w:val="16"/>
+              </w:rPr>
+              <w:t>Distinct Type ID for Type CHANNEL PARTNER + DIRECT DEALER, counted separately from counters.</w:t>
+            </w:r>
+          </w:p>
+        </w:tc>
+      </w:tr>
+      <w:tr>
+        <w:trPr>
+          <w:cantSplit/>
+        </w:trPr>
+        <w:tc>
+          <w:tcPr>
+            <w:tcW w:type="dxa" w:w="2477"/>
+            <w:vAlign w:val="center"/>
+            <w:shd w:fill="F1F6FA"/>
+          </w:tcPr>
+          <w:p>
+            <w:pPr>
+              <w:spacing w:after="0" w:before="0"/>
+            </w:pPr>
+            <w:r/>
+            <w:r>
+              <w:rPr>
+                <w:rFonts w:ascii="Aptos" w:hAnsi="Aptos"/>
+                <w:b w:val="0"/>
+                <w:color w:val="26384A"/>
+                <w:sz w:val="16"/>
+              </w:rPr>
+              <w:t>TOTAL ORDER COUNT / SALE</w:t>
+            </w:r>
+          </w:p>
+        </w:tc>
+        <w:tc>
+          <w:tcPr>
+            <w:tcW w:type="dxa" w:w="6523"/>
+            <w:vAlign w:val="center"/>
+            <w:shd w:fill="F1F6FA"/>
+          </w:tcPr>
+          <w:p>
+            <w:pPr>
+              <w:spacing w:after="0" w:before="0"/>
+            </w:pPr>
+            <w:r/>
+            <w:r>
+              <w:rPr>
+                <w:rFonts w:ascii="Aptos" w:hAnsi="Aptos"/>
+                <w:b w:val="0"/>
+                <w:color w:val="26384A"/>
+                <w:sz w:val="16"/>
+              </w:rPr>
+              <w:t>PENDING SOURCE DATA until a separate Secondary Orders workbook is inspected for verified order key, date, retailer and BDO mappings, and amount field. The existing Check-In Secondary Order Count and Basic Order Value are deliberately not substituted.</w:t>
+            </w:r>
+          </w:p>
+        </w:tc>
+      </w:tr>
+      <w:tr>
+        <w:trPr>
+          <w:cantSplit/>
+        </w:trPr>
+        <w:tc>
+          <w:tcPr>
+            <w:tcW w:type="dxa" w:w="2477"/>
+            <w:vAlign w:val="center"/>
+          </w:tcPr>
+          <w:p>
+            <w:pPr>
+              <w:spacing w:after="0" w:before="0"/>
+            </w:pPr>
+            <w:r/>
+            <w:r>
+              <w:rPr>
+                <w:rFonts w:ascii="Aptos" w:hAnsi="Aptos"/>
+                <w:b w:val="0"/>
+                <w:color w:val="26384A"/>
+                <w:sz w:val="16"/>
+              </w:rPr>
+              <w:t>REMARKS</w:t>
+            </w:r>
+          </w:p>
+        </w:tc>
+        <w:tc>
+          <w:tcPr>
+            <w:tcW w:type="dxa" w:w="6523"/>
+            <w:vAlign w:val="center"/>
+          </w:tcPr>
+          <w:p>
+            <w:pPr>
+              <w:spacing w:after="0" w:before="0"/>
+            </w:pPr>
+            <w:r/>
+            <w:r>
+              <w:rPr>
+                <w:rFonts w:ascii="Aptos" w:hAnsi="Aptos"/>
+                <w:b w:val="0"/>
+                <w:color w:val="26384A"/>
+                <w:sz w:val="16"/>
+              </w:rPr>
+              <w:t>Remark or Remarks; distinct nonblank notes from the employee-day are retained.</w:t>
+            </w:r>
+          </w:p>
+        </w:tc>
+      </w:tr>
+      <w:tr>
+        <w:trPr>
+          <w:cantSplit/>
+        </w:trPr>
+        <w:tc>
+          <w:tcPr>
+            <w:tcW w:type="dxa" w:w="2477"/>
+            <w:vAlign w:val="center"/>
+            <w:shd w:fill="F1F6FA"/>
+          </w:tcPr>
+          <w:p>
+            <w:pPr>
+              <w:spacing w:after="0" w:before="0"/>
+            </w:pPr>
+            <w:r/>
+            <w:r>
+              <w:rPr>
+                <w:rFonts w:ascii="Aptos" w:hAnsi="Aptos"/>
+                <w:b w:val="0"/>
+                <w:color w:val="26384A"/>
+                <w:sz w:val="16"/>
+              </w:rPr>
+              <w:t>Quality checks</w:t>
+            </w:r>
+          </w:p>
+        </w:tc>
+        <w:tc>
+          <w:tcPr>
+            <w:tcW w:type="dxa" w:w="6523"/>
+            <w:vAlign w:val="center"/>
+            <w:shd w:fill="F1F6FA"/>
+          </w:tcPr>
+          <w:p>
+            <w:pPr>
+              <w:spacing w:after="0" w:before="0"/>
+            </w:pPr>
+            <w:r/>
+            <w:r>
+              <w:rPr>
+                <w:rFonts w:ascii="Aptos" w:hAnsi="Aptos"/>
+                <w:b w:val="0"/>
+                <w:color w:val="26384A"/>
+                <w:sz w:val="16"/>
+              </w:rPr>
+              <w:t>00:00:00 requires source-convention validation and is not counted as valid. Negative spans and spans above 18 hours are flagged for review; source rows are not deleted.</w:t>
+            </w:r>
+          </w:p>
+        </w:tc>
+      </w:tr>
+      <w:tr>
+        <w:trPr>
+          <w:cantSplit/>
+        </w:trPr>
+        <w:tc>
+          <w:tcPr>
+            <w:tcW w:type="dxa" w:w="2477"/>
+            <w:vAlign w:val="center"/>
+          </w:tcPr>
+          <w:p>
+            <w:pPr>
+              <w:spacing w:after="0" w:before="0"/>
+            </w:pPr>
+            <w:r/>
+            <w:r>
+              <w:rPr>
+                <w:rFonts w:ascii="Aptos" w:hAnsi="Aptos"/>
+                <w:b w:val="0"/>
+                <w:color w:val="26384A"/>
+                <w:sz w:val="16"/>
+              </w:rPr>
+              <w:t>Filters and exports</w:t>
+            </w:r>
+          </w:p>
+        </w:tc>
+        <w:tc>
+          <w:tcPr>
+            <w:tcW w:type="dxa" w:w="6523"/>
+            <w:vAlign w:val="center"/>
+          </w:tcPr>
+          <w:p>
+            <w:pPr>
+              <w:spacing w:after="0" w:before="0"/>
+            </w:pPr>
+            <w:r/>
+            <w:r>
+              <w:rPr>
+                <w:rFonts w:ascii="Aptos" w:hAnsi="Aptos"/>
+                <w:b w:val="0"/>
+                <w:color w:val="26384A"/>
+                <w:sz w:val="16"/>
+              </w:rPr>
+              <w:t>Month, start/end date, BDO, state, attendance status, and remarks/exception search apply to KPI cards, detail rows, CSV, and Excel exports. The export keeps the exact 13 detail columns in the displayed order; the table supports sorting, pagination, and horizontal scrolling.</w:t>
+            </w:r>
+          </w:p>
+        </w:tc>
+      </w:tr>
+    </w:tbl>
+    <w:p>
+      <w:pPr>
+        <w:spacing w:after="20"/>
+      </w:pPr>
+    </w:p>
+    <w:p>
+      <w:r>
+        <w:t>KPI cards show Unique BDOs, Employee-day records, Valid Check-Ins, Valid Check-Outs, Total and Average Working Time, Total Counters Planned, Total Counters Visited, Counter Achievement %, Total CP Visits, Total Order Count, Total Sales, and records with missing/invalid attendance timestamps. Counter Achievement is Total Counters Visited ÷ Total Counters Planned × 100 when planned is greater than zero. Missing source values are not converted to zero.</w:t>
+      </w:r>
+    </w:p>
+    <w:p>
+      <w:pPr>
+        <w:pStyle w:val="Heading1"/>
+        <w:keepNext/>
+      </w:pPr>
+      <w:r>
+        <w:t>15. Inputs, storage, and interpretation</w:t>
       </w:r>
     </w:p>
     <w:tbl>
@@ -2640,7 +3334,7 @@
         <w:keepNext/>
       </w:pPr>
       <w:r>
-        <w:t>15. Reconciliation checklist</w:t>
+        <w:t>16. Reconciliation checklist</w:t>
       </w:r>
     </w:p>
     <w:p>
@@ -3355,6 +4049,149 @@
           </w:p>
         </w:tc>
       </w:tr>
+      <w:tr>
+        <w:trPr>
+          <w:cantSplit/>
+        </w:trPr>
+        <w:tc>
+          <w:tcPr>
+            <w:tcW w:type="dxa" w:w="2054"/>
+            <w:vAlign w:val="center"/>
+          </w:tcPr>
+          <w:p>
+            <w:pPr>
+              <w:spacing w:after="0" w:before="0"/>
+            </w:pPr>
+            <w:r/>
+            <w:r>
+              <w:rPr>
+                <w:rFonts w:ascii="Aptos" w:hAnsi="Aptos"/>
+                <w:b w:val="0"/>
+                <w:color w:val="26384A"/>
+                <w:sz w:val="16"/>
+              </w:rPr>
+              <w:t>Check-In/Check-Out employee-day</w:t>
+            </w:r>
+          </w:p>
+        </w:tc>
+        <w:tc>
+          <w:tcPr>
+            <w:tcW w:type="dxa" w:w="6946"/>
+            <w:vAlign w:val="center"/>
+          </w:tcPr>
+          <w:p>
+            <w:pPr>
+              <w:spacing w:after="0" w:before="0"/>
+            </w:pPr>
+            <w:r/>
+            <w:r>
+              <w:rPr>
+                <w:rFonts w:ascii="Aptos" w:hAnsi="Aptos"/>
+                <w:b w:val="0"/>
+                <w:color w:val="26384A"/>
+                <w:sz w:val="16"/>
+              </w:rPr>
+              <w:t>Group by Emp ID + parsed date. Rows without an Emp ID remain separate rather than being deduplicated by BDO name + date; unique BDO display may still use normalized names.</w:t>
+            </w:r>
+          </w:p>
+        </w:tc>
+      </w:tr>
+      <w:tr>
+        <w:trPr>
+          <w:cantSplit/>
+        </w:trPr>
+        <w:tc>
+          <w:tcPr>
+            <w:tcW w:type="dxa" w:w="2054"/>
+            <w:vAlign w:val="center"/>
+            <w:shd w:fill="F1F6FA"/>
+          </w:tcPr>
+          <w:p>
+            <w:pPr>
+              <w:spacing w:after="0" w:before="0"/>
+            </w:pPr>
+            <w:r/>
+            <w:r>
+              <w:rPr>
+                <w:rFonts w:ascii="Aptos" w:hAnsi="Aptos"/>
+                <w:b w:val="0"/>
+                <w:color w:val="26384A"/>
+                <w:sz w:val="16"/>
+              </w:rPr>
+              <w:t>Counter / CP visits</w:t>
+            </w:r>
+          </w:p>
+        </w:tc>
+        <w:tc>
+          <w:tcPr>
+            <w:tcW w:type="dxa" w:w="6946"/>
+            <w:vAlign w:val="center"/>
+            <w:shd w:fill="F1F6FA"/>
+          </w:tcPr>
+          <w:p>
+            <w:pPr>
+              <w:spacing w:after="0" w:before="0"/>
+            </w:pPr>
+            <w:r/>
+            <w:r>
+              <w:rPr>
+                <w:rFonts w:ascii="Aptos" w:hAnsi="Aptos"/>
+                <w:b w:val="0"/>
+                <w:color w:val="26384A"/>
+                <w:sz w:val="16"/>
+              </w:rPr>
+              <w:t>Distinct Type ID by employee-day: DEALER + OTHER/OTHERS for counters; CHANNEL PARTNER + DIRECT DEALER for CP visits.</w:t>
+            </w:r>
+          </w:p>
+        </w:tc>
+      </w:tr>
+      <w:tr>
+        <w:trPr>
+          <w:cantSplit/>
+        </w:trPr>
+        <w:tc>
+          <w:tcPr>
+            <w:tcW w:type="dxa" w:w="2054"/>
+            <w:vAlign w:val="center"/>
+          </w:tcPr>
+          <w:p>
+            <w:pPr>
+              <w:spacing w:after="0" w:before="0"/>
+            </w:pPr>
+            <w:r/>
+            <w:r>
+              <w:rPr>
+                <w:rFonts w:ascii="Aptos" w:hAnsi="Aptos"/>
+                <w:b w:val="0"/>
+                <w:color w:val="26384A"/>
+                <w:sz w:val="16"/>
+              </w:rPr>
+              <w:t>Check-In/Check-Out working time</w:t>
+            </w:r>
+          </w:p>
+        </w:tc>
+        <w:tc>
+          <w:tcPr>
+            <w:tcW w:type="dxa" w:w="6946"/>
+            <w:vAlign w:val="center"/>
+          </w:tcPr>
+          <w:p>
+            <w:pPr>
+              <w:spacing w:after="0" w:before="0"/>
+            </w:pPr>
+            <w:r/>
+            <w:r>
+              <w:rPr>
+                <w:rFonts w:ascii="Aptos" w:hAnsi="Aptos"/>
+                <w:b w:val="0"/>
+                <w:color w:val="26384A"/>
+                <w:sz w:val="16"/>
+              </w:rPr>
+              <w:t>Earliest valid Check In to latest valid Check Out; daily spans over 18 hours and negative spans are excluded from valid total and flagged.</w:t>
+            </w:r>
+          </w:p>
+        </w:tc>
+      </w:tr>
     </w:tbl>
     <w:p>
       <w:pPr>

</xml_diff>

<commit_message>
Add secondary orders uploader to check-in-out report
</commit_message>
<xml_diff>
--- a/docs/Check-In_Route_Analytics_Dashboard_SOP.docx
+++ b/docs/Check-In_Route_Analytics_Dashboard_SOP.docx
@@ -126,7 +126,7 @@
                 <w:color w:val="26384A"/>
                 <w:sz w:val="16"/>
               </w:rPr>
-              <w:t>1.4 · 24 October 2026</w:t>
+              <w:t>1.5 · 24 October 2026</w:t>
             </w:r>
           </w:p>
         </w:tc>
@@ -2857,7 +2857,7 @@
                 <w:color w:val="26384A"/>
                 <w:sz w:val="16"/>
               </w:rPr>
-              <w:t>PENDING SOURCE DATA until a separate Secondary Orders workbook is inspected for verified order key, date, retailer and BDO mappings, and amount field. The existing Check-In Secondary Order Count and Basic Order Value are deliberately not substituted.</w:t>
+              <w:t>Upload the separate Secondary Orders Excel/CSV in the uploader on this same tab. Order count is distinct Order ID / Order No / Invoice No matched to a Check-In employee-day by Date Created + employee ID (name fallback only when ID is missing). SALE sums Basic order value (Excel column V; legacy Basic Amount accepted) only. Other amount fields are ignored.</w:t>
             </w:r>
           </w:p>
         </w:tc>
@@ -3013,7 +3013,7 @@
     </w:p>
     <w:p>
       <w:r>
-        <w:t>KPI cards show Unique BDOs, Employee-day records, Valid Check-Ins, Valid Check-Outs, Total and Average Working Time, Total Counters Planned, Total Counters Visited, Counter Achievement %, Total CP Visits, Total Order Count, Total Sales, and records with missing/invalid attendance timestamps. Counter Achievement is Total Counters Visited ÷ Total Counters Planned × 100 when planned is greater than zero. Missing source values are not converted to zero.</w:t>
+        <w:t>KPI cards show Unique BDOs, Employee-day records, Valid Check-Ins, Valid Check-Outs, Total and Average Working Time, Total Counters Planned, Total Counters Visited, Counter Achievement %, Total CP Visits, Total Order Count, Total Sales, and records with missing/invalid attendance timestamps. Counter Achievement is Total Counters Visited ÷ Total Counters Planned × 100 when planned is greater than zero. Missing source values are not converted to zero. For secondary orders, rows outside the uploaded file date range remain pending; rows within the range with no matched order show zero. Duplicate Order IDs are counted once, unmatched orders are excluded and reported in uploader audit counts, and missing Basic Order Value prevents a complete sales total.</w:t>
       </w:r>
     </w:p>
     <w:p>
@@ -3313,6 +3313,77 @@
                 <w:sz w:val="16"/>
               </w:rPr>
               <w:t>Company/customer identity, account/customer code, assignments, plan dates, beat, address, GPS.</w:t>
+            </w:r>
+          </w:p>
+        </w:tc>
+      </w:tr>
+      <w:tr>
+        <w:trPr>
+          <w:cantSplit/>
+        </w:trPr>
+        <w:tc>
+          <w:tcPr>
+            <w:tcW w:type="dxa" w:w="1993"/>
+            <w:vAlign w:val="center"/>
+            <w:shd w:fill="F1F6FA"/>
+          </w:tcPr>
+          <w:p>
+            <w:pPr>
+              <w:spacing w:after="0" w:before="0"/>
+            </w:pPr>
+            <w:r/>
+            <w:r>
+              <w:rPr>
+                <w:rFonts w:ascii="Aptos" w:hAnsi="Aptos"/>
+                <w:b w:val="0"/>
+                <w:color w:val="26384A"/>
+                <w:sz w:val="16"/>
+              </w:rPr>
+              <w:t>Secondary Orders (optional, on CHECKIN-OUT REPORT)</w:t>
+            </w:r>
+          </w:p>
+        </w:tc>
+        <w:tc>
+          <w:tcPr>
+            <w:tcW w:type="dxa" w:w="3020"/>
+            <w:vAlign w:val="center"/>
+            <w:shd w:fill="F1F6FA"/>
+          </w:tcPr>
+          <w:p>
+            <w:pPr>
+              <w:spacing w:after="0" w:before="0"/>
+            </w:pPr>
+            <w:r/>
+            <w:r>
+              <w:rPr>
+                <w:rFonts w:ascii="Aptos" w:hAnsi="Aptos"/>
+                <w:b w:val="0"/>
+                <w:color w:val="26384A"/>
+                <w:sz w:val="16"/>
+              </w:rPr>
+              <w:t>Total Order Count and SALE in the Check-In Check-Out report.</w:t>
+            </w:r>
+          </w:p>
+        </w:tc>
+        <w:tc>
+          <w:tcPr>
+            <w:tcW w:type="dxa" w:w="3987"/>
+            <w:vAlign w:val="center"/>
+            <w:shd w:fill="F1F6FA"/>
+          </w:tcPr>
+          <w:p>
+            <w:pPr>
+              <w:spacing w:after="0" w:before="0"/>
+            </w:pPr>
+            <w:r/>
+            <w:r>
+              <w:rPr>
+                <w:rFonts w:ascii="Aptos" w:hAnsi="Aptos"/>
+                <w:b w:val="0"/>
+                <w:color w:val="26384A"/>
+                <w:sz w:val="16"/>
+              </w:rPr>
+              <w:t>Requires a unique Order ID/Order No/Invoice No, Date Created or a supported order date, employee ID or sales user name, and Basic order value (Excel V). The upload is browser-memory only and is cleared on refresh/close.</w:t>
             </w:r>
           </w:p>
         </w:tc>

</xml_diff>

<commit_message>
Count counter visits from check-in type
</commit_message>
<xml_diff>
--- a/docs/Check-In_Route_Analytics_Dashboard_SOP.docx
+++ b/docs/Check-In_Route_Analytics_Dashboard_SOP.docx
@@ -126,7 +126,7 @@
                 <w:color w:val="26384A"/>
                 <w:sz w:val="16"/>
               </w:rPr>
-              <w:t>1.5 · 24 October 2026</w:t>
+              <w:t>1.6 · 24 October 2026</w:t>
             </w:r>
           </w:p>
         </w:tc>
@@ -2761,7 +2761,7 @@
                 <w:color w:val="26384A"/>
                 <w:sz w:val="16"/>
               </w:rPr>
-              <w:t>Distinct Type ID for Type DEALER + OTHER/OTHERS. Repeated IDs count once per employee-day. Missing Type ID values in qualifying rows make that subtotal unavailable.</w:t>
+              <w:t>Count Check-In source rows whose Type is DEALER or OTHER/OTHERS within the employee-day. This uses the Check-In Type field only; Type ID is not required for Counter Visited.</w:t>
             </w:r>
           </w:p>
         </w:tc>
@@ -2808,7 +2808,7 @@
                 <w:color w:val="26384A"/>
                 <w:sz w:val="16"/>
               </w:rPr>
-              <w:t>Distinct Type ID for Type CHANNEL PARTNER + DIRECT DEALER, counted separately from counters.</w:t>
+              <w:t>Distinct Type ID for Type CHANNEL PARTNER + DIRECT DEALER, counted separately from counters. Type ID is required for this unique count.</w:t>
             </w:r>
           </w:p>
         </w:tc>

</xml_diff>

<commit_message>
Style check-in attendance report and add filters
</commit_message>
<xml_diff>
--- a/docs/Check-In_Route_Analytics_Dashboard_SOP.docx
+++ b/docs/Check-In_Route_Analytics_Dashboard_SOP.docx
@@ -126,7 +126,7 @@
                 <w:color w:val="26384A"/>
                 <w:sz w:val="16"/>
               </w:rPr>
-              <w:t>1.6 · 24 October 2026</w:t>
+              <w:t>1.7 · 24 October 2026</w:t>
             </w:r>
           </w:p>
         </w:tc>
@@ -2712,7 +2712,7 @@
                 <w:color w:val="26384A"/>
                 <w:sz w:val="16"/>
               </w:rPr>
-              <w:t>Counter Planned, Counters Planned, or Planned Counters. Conflicting or missing values remain unavailable.</w:t>
+              <w:t>Fixed at 10 per employee-day; the workbook Counter Planned column is not used for this report.</w:t>
             </w:r>
           </w:p>
         </w:tc>
@@ -2953,7 +2953,7 @@
                 <w:color w:val="26384A"/>
                 <w:sz w:val="16"/>
               </w:rPr>
-              <w:t>00:00:00 requires source-convention validation and is not counted as valid. Negative spans and spans above 18 hours are flagged for review; source rows are not deleted.</w:t>
+              <w:t>00:00:00 requires source-convention validation and is not counted as valid. Negative spans and spans above 18 hours are flagged for review; source rows are not deleted. Red conditional formatting marks Check In after 10:30 AM, Check Out before 7:30 PM, working time below 7 hours, or Counter Visited below 8. Missing/invalid times do not trigger time-threshold formatting.</w:t>
             </w:r>
           </w:p>
         </w:tc>
@@ -3000,7 +3000,7 @@
                 <w:color w:val="26384A"/>
                 <w:sz w:val="16"/>
               </w:rPr>
-              <w:t>Month, start/end date, BDO, state, attendance status, and remarks/exception search apply to KPI cards, detail rows, CSV, and Excel exports. The export keeps the exact 13 detail columns in the displayed order; the table supports sorting, pagination, and horizontal scrolling.</w:t>
+              <w:t>Month, start/end date, BDO, state, Zonal Manager, Reporting Manager, attendance status, and remarks/exception search apply to KPI cards, detail rows, CSV, and Excel exports. The export keeps the exact 13 detail columns in the displayed order; the table supports sorting, pagination, and horizontal scrolling. The table uses a blue title band, yellow identity headers, and green metric headers as in the supplied reference.</w:t>
             </w:r>
           </w:p>
         </w:tc>
@@ -3013,7 +3013,7 @@
     </w:p>
     <w:p>
       <w:r>
-        <w:t>KPI cards show Unique BDOs, Employee-day records, Valid Check-Ins, Valid Check-Outs, Total and Average Working Time, Total Counters Planned, Total Counters Visited, Counter Achievement %, Total CP Visits, Total Order Count, Total Sales, and records with missing/invalid attendance timestamps. Counter Achievement is Total Counters Visited ÷ Total Counters Planned × 100 when planned is greater than zero. Missing source values are not converted to zero. For secondary orders, rows outside the uploaded file date range remain pending; rows within the range with no matched order show zero. Duplicate Order IDs are counted once, unmatched orders are excluded and reported in uploader audit counts, and missing Basic Order Value prevents a complete sales total.</w:t>
+        <w:t>KPI cards show Unique BDOs, Employee-day records, Valid Check-Ins, Valid Check-Outs, Total and Average Working Time, Total Counters Planned, Total Counters Visited, Counter Achievement %, Total CP Visits, Total Order Count, Total Sales, and records with missing/invalid attendance timestamps. Counter Planned is 10 for each employee-day. Counter Achievement is Total Counters Visited ÷ Total Counters Planned × 100 when planned is greater than zero. Missing source values are not converted to zero. For secondary orders, rows outside the uploaded file date range remain pending; rows within the range with no matched order show zero. Duplicate Order IDs are counted once, unmatched orders are excluded and reported in uploader audit counts, and missing Basic Order Value prevents a complete sales total.</w:t>
       </w:r>
     </w:p>
     <w:p>
@@ -3562,11 +3562,6 @@
     <w:p>
       <w:r>
         <w:t>DEPUTY MANAGER-SALES; DEPUTY MANAGER-SALES (4); MANAGER-SALES; MANAGER-SALES (4); ASSISTANT MANAGER-SALES; ASSISTANT MANAGER-SALES (4); ASSISTANT MANAGER-SALES (NBD) (4); AGM-SALES; SR.MANAGER-SALES (9); DGM-SALES. Reports specifying Zonal Manager exclusions also omit SHOBHIT GOEL; OTHERS; ARCHIT GARG; SHANTANU ATTARY.</w:t>
-      </w:r>
-    </w:p>
-    <w:p>
-      <w:r>
-        <w:br w:type="page"/>
       </w:r>
     </w:p>
     <w:p>

</xml_diff>

<commit_message>
Add print and image exports for filtered check-in report
</commit_message>
<xml_diff>
--- a/docs/Check-In_Route_Analytics_Dashboard_SOP.docx
+++ b/docs/Check-In_Route_Analytics_Dashboard_SOP.docx
@@ -126,7 +126,7 @@
                 <w:color w:val="26384A"/>
                 <w:sz w:val="16"/>
               </w:rPr>
-              <w:t>1.7 · 24 October 2026</w:t>
+              <w:t>1.8 · 24 October 2026</w:t>
             </w:r>
           </w:p>
         </w:tc>
@@ -3000,7 +3000,7 @@
                 <w:color w:val="26384A"/>
                 <w:sz w:val="16"/>
               </w:rPr>
-              <w:t>Month, start/end date, BDO, state, Zonal Manager, Reporting Manager, attendance status, and remarks/exception search apply to KPI cards, detail rows, CSV, and Excel exports. The export keeps the exact 13 detail columns in the displayed order; the table supports sorting, pagination, and horizontal scrolling. The table uses a blue title band, yellow identity headers, and green metric headers as in the supplied reference.</w:t>
+              <w:t>Month, start/end date, BDO, state, Zonal Manager, Reporting Manager, attendance status, and remarks/exception search apply to KPI cards, detail rows, CSV, Excel, print, and image actions. CSV/Excel and Print Filtered Report include all filtered rows. Download Page Image captures the current visible page of filtered rows. The export keeps the exact 13 detail columns in the displayed order; the table supports sorting, pagination, and horizontal scrolling. The table uses a blue title band, yellow identity headers, and green metric headers as in the supplied reference.</w:t>
             </w:r>
           </w:p>
         </w:tc>

</xml_diff>

<commit_message>
Resolve State and UT from check-in locations
</commit_message>
<xml_diff>
--- a/docs/Check-In_Route_Analytics_Dashboard_SOP.docx
+++ b/docs/Check-In_Route_Analytics_Dashboard_SOP.docx
@@ -126,7 +126,7 @@
                 <w:color w:val="26384A"/>
                 <w:sz w:val="16"/>
               </w:rPr>
-              <w:t>1.8 · 24 October 2026</w:t>
+              <w:t>1.9 · 24 October 2026</w:t>
             </w:r>
           </w:p>
         </w:tc>
@@ -2569,7 +2569,7 @@
                 <w:color w:val="26384A"/>
                 <w:sz w:val="16"/>
               </w:rPr>
-              <w:t>BDO NAME uses Sales User Name (or BDO Name). STATE NAME uses State Name or State. Missing columns display SOURCE DATA REQUIRED.</w:t>
+              <w:t>BDO NAME uses Sales User Name (or BDO Name). STATE NAME is normalized to a recognized Indian State or Union Territory from State Name/State first, then Check-In Location or Check-Out Location. Location text must contain the state/UT name; coordinates are not sent to an external geocoding service. Unrecognized or unavailable state values display SOURCE DATA REQUIRED.</w:t>
             </w:r>
           </w:p>
         </w:tc>

</xml_diff>

<commit_message>
Keep State filter options to one state per employee-day
</commit_message>
<xml_diff>
--- a/docs/Check-In_Route_Analytics_Dashboard_SOP.docx
+++ b/docs/Check-In_Route_Analytics_Dashboard_SOP.docx
@@ -2569,7 +2569,7 @@
                 <w:color w:val="26384A"/>
                 <w:sz w:val="16"/>
               </w:rPr>
-              <w:t>BDO NAME uses Sales User Name (or BDO Name). STATE NAME is normalized to a recognized Indian State or Union Territory from State Name/State first, then Check-In Location or Check-Out Location. Location text must contain the state/UT name; coordinates are not sent to an external geocoding service. Unrecognized or unavailable state values display SOURCE DATA REQUIRED.</w:t>
+              <w:t>BDO NAME uses Sales User Name (or BDO Name). Assign one canonical Indian State/UT per employee-day, using the most frequent recognized State/State Name first, then the most frequent State/UT in Check-In/Check-Out Location. Filters therefore show individual names only. Location text must include a State/UT; coordinates are not sent externally. Unrecognized values display SOURCE DATA REQUIRED.</w:t>
             </w:r>
           </w:p>
         </w:tc>
@@ -3000,7 +3000,7 @@
                 <w:color w:val="26384A"/>
                 <w:sz w:val="16"/>
               </w:rPr>
-              <w:t>The report heading and export controls are followed by filters, then the detail table. Screenshot View is in the report heading and opens every matching row full-screen. The uploader, source notes, and KPI cards follow the table. Month, dates, BDO, state, managers, attendance status, and remarks filters apply to KPI cards, rows, and exports. CSV, Excel, and Print Filtered Report include all filtered rows; Download Page Image saves the current page. The 13-column table supports sorting, pagination, and horizontal scrolling; data cells are center-aligned, with a blue title band, yellow identity headers, and green metric headers.</w:t>
+              <w:t>The order is heading/exports → filters → detail table → uploader, source notes, and KPI cards. Screenshot View in the heading opens all matching rows full-screen. Filters cover month, dates, BDO, state, managers, attendance, and remarks; they apply to cards, rows, and exports. CSV, Excel, and Print include all matches; Page Image saves the current page. The 13-column table supports sorting and pagination; cells are centered and columns scroll horizontally. Headers use blue, yellow, and green bands.</w:t>
             </w:r>
           </w:p>
         </w:tc>

</xml_diff>

<commit_message>
Allow monthly future sales plan editing
</commit_message>
<xml_diff>
--- a/docs/Check-In_Route_Analytics_Dashboard_SOP.docx
+++ b/docs/Check-In_Route_Analytics_Dashboard_SOP.docx
@@ -1747,7 +1747,7 @@
     </w:p>
     <w:p>
       <w:r>
-        <w:t>This is a plan-versus-actual table with eight KPIs and four weekly buckets. Plans are editable per week. Most actual values are calculated from Check-In; Old Retailer Retained and New Retailer Added are manual actuals.</w:t>
+        <w:t>This is a plan-versus-actual table with eight KPIs and four weekly buckets. Plans are editable per week for the selected month; the month picker includes the following 12 months even when no Check-In rows exist yet. Each month’s plan overrides are saved separately in this browser, so saving next month does not replace a prior month. For a future month without source rows, calculated actuals remain Pending. Most actual values are calculated from Check-In; Old Retailer Retained and New Retailer Added are manual actuals.</w:t>
       </w:r>
     </w:p>
     <w:tbl>
@@ -2142,7 +2142,7 @@
                 <w:color w:val="26384A"/>
                 <w:sz w:val="16"/>
               </w:rPr>
-              <w:t>Weekly plan is editable; actual is typed manually and saved in this browser. Blank actual displays Pending.</w:t>
+              <w:t>Weekly plan is editable per month; actual is typed manually and saved by month in this browser. Blank actual displays Pending.</w:t>
             </w:r>
           </w:p>
         </w:tc>
@@ -2191,7 +2191,7 @@
                 <w:color w:val="26384A"/>
                 <w:sz w:val="16"/>
               </w:rPr>
-              <w:t>Weekly plan is editable; actual is typed manually and saved in this browser. Blank actual displays Pending.</w:t>
+              <w:t>Weekly plan is editable per month; actual is typed manually and saved by month in this browser. Blank actual displays Pending.</w:t>
             </w:r>
           </w:p>
         </w:tc>

</xml_diff>

<commit_message>
Add per-question weekly actual reports
</commit_message>
<xml_diff>
--- a/docs/Check-In_Route_Analytics_Dashboard_SOP.docx
+++ b/docs/Check-In_Route_Analytics_Dashboard_SOP.docx
@@ -126,7 +126,7 @@
                 <w:color w:val="26384A"/>
                 <w:sz w:val="16"/>
               </w:rPr>
-              <w:t>1.9 · 24 October 2026</w:t>
+              <w:t>2.1 · 31 October 2026</w:t>
             </w:r>
           </w:p>
         </w:tc>
@@ -1032,6 +1032,15 @@
       </w:pPr>
       <w:r>
         <w:t>Use Calculation Details or source audit tables to inspect source rows, eligibility, duplicates, missing identifiers, and exclusion reasons when a KPI does not reconcile.</w:t>
+      </w:r>
+    </w:p>
+    <w:p>
+      <w:pPr>
+        <w:pStyle w:val="ListBullet"/>
+        <w:spacing w:after="40"/>
+      </w:pPr>
+      <w:r>
+        <w:t>In Weekly Sales Performance, use the individual question report list below the table to download a separate CSV or Excel report for each KPI, with all four weekly actuals and, for calculated KPIs, the Check-In rows and contribution values behind those actuals. The Actuals Detail CSV and Actuals Detail Excel buttons also download all KPIs together.</w:t>
       </w:r>
     </w:p>
     <w:p>
@@ -2205,6 +2214,11 @@
     <w:p>
       <w:r>
         <w:t>Weekly order count and amount are calculated from the Check-In report only, using Joint Working and Secondary sales fields. The dashboard no longer includes a separate Secondary Sales workbook uploader; Basic Order Value and secondary order evidence in the Check-In source continue to drive these actuals.</w:t>
+      </w:r>
+    </w:p>
+    <w:p>
+      <w:r>
+        <w:t>Individual Question Actual Reports below the weekly table provide a separate CSV and Excel download for each of the eight KPIs. Each report includes the selected month’s four weekly actuals; calculated KPIs also include their qualifying Check-In source rows with contribution columns and rule. Manual retailer reports identify the entered values and explain that no Check-In source rows exist. The Actuals Detail CSV and Actuals Detail Excel buttons remain available for combined exports across every KPI. In the combined Excel workbook there is an Actual Summary plus separate detail tabs; the combined CSV starts with a weekly actual summary for every KPI/week, followed by combined source detail rows. The detail includes Check-In source row, date, employee identity/designation, Joint Working fields, Type/Type ID, secondary order fields, reported weekly actual, per-row contribution, and the KPI rule. Contribution fields can be summed by KPI and week to reconcile the displayed actual; distinct-count KPIs give duplicate rows a zero contribution. Manual retailer counts are labelled as user-entered values and do not have Check-In source rows. The W1 joint-working actual of 106 is reconciled by summing Employee-Date Contribution for Week 1.</w:t>
       </w:r>
     </w:p>
     <w:p>
@@ -3565,6 +3579,11 @@
       </w:r>
     </w:p>
     <w:p>
+      <w:r>
+        <w:br w:type="page"/>
+      </w:r>
+    </w:p>
+    <w:p>
       <w:pPr>
         <w:pStyle w:val="Heading1"/>
         <w:keepNext/>
@@ -3992,6 +4011,54 @@
                 <w:color w:val="26384A"/>
                 <w:sz w:val="16"/>
               </w:rPr>
+              <w:t>Weekly retailers visited</w:t>
+            </w:r>
+          </w:p>
+        </w:tc>
+        <w:tc>
+          <w:tcPr>
+            <w:tcW w:type="dxa" w:w="6946"/>
+            <w:vAlign w:val="center"/>
+            <w:shd w:fill="F1F6FA"/>
+          </w:tcPr>
+          <w:p>
+            <w:pPr>
+              <w:spacing w:after="0" w:before="0"/>
+            </w:pPr>
+            <w:r/>
+            <w:r>
+              <w:rPr>
+                <w:rFonts w:ascii="Aptos" w:hAnsi="Aptos"/>
+                <w:b w:val="0"/>
+                <w:color w:val="26384A"/>
+                <w:sz w:val="16"/>
+              </w:rPr>
+              <w:t>The same qualifying source rows and count from the Manager + Territory Q.2 result.</w:t>
+            </w:r>
+          </w:p>
+        </w:tc>
+      </w:tr>
+      <w:tr>
+        <w:trPr>
+          <w:cantSplit/>
+        </w:trPr>
+        <w:tc>
+          <w:tcPr>
+            <w:tcW w:type="dxa" w:w="2054"/>
+            <w:vAlign w:val="center"/>
+          </w:tcPr>
+          <w:p>
+            <w:pPr>
+              <w:spacing w:after="0" w:before="0"/>
+            </w:pPr>
+            <w:r/>
+            <w:r>
+              <w:rPr>
+                <w:rFonts w:ascii="Aptos" w:hAnsi="Aptos"/>
+                <w:b w:val="0"/>
+                <w:color w:val="26384A"/>
+                <w:sz w:val="16"/>
+              </w:rPr>
               <w:t>Weekly orders</w:t>
             </w:r>
           </w:p>
@@ -4000,7 +4067,6 @@
           <w:tcPr>
             <w:tcW w:type="dxa" w:w="6946"/>
             <w:vAlign w:val="center"/>
-            <w:shd w:fill="F1F6FA"/>
           </w:tcPr>
           <w:p>
             <w:pPr>
@@ -4027,6 +4093,7 @@
           <w:tcPr>
             <w:tcW w:type="dxa" w:w="2054"/>
             <w:vAlign w:val="center"/>
+            <w:shd w:fill="F1F6FA"/>
           </w:tcPr>
           <w:p>
             <w:pPr>
@@ -4048,6 +4115,7 @@
           <w:tcPr>
             <w:tcW w:type="dxa" w:w="6946"/>
             <w:vAlign w:val="center"/>
+            <w:shd w:fill="F1F6FA"/>
           </w:tcPr>
           <w:p>
             <w:pPr>
@@ -4062,6 +4130,53 @@
                 <w:sz w:val="16"/>
               </w:rPr>
               <w:t>Amount = sum Basic Order Value for qualifying Check-In rows, rounded up. AOV = amount ÷ unique order retailers, rounded up.</w:t>
+            </w:r>
+          </w:p>
+        </w:tc>
+      </w:tr>
+      <w:tr>
+        <w:trPr>
+          <w:cantSplit/>
+        </w:trPr>
+        <w:tc>
+          <w:tcPr>
+            <w:tcW w:type="dxa" w:w="2054"/>
+            <w:vAlign w:val="center"/>
+          </w:tcPr>
+          <w:p>
+            <w:pPr>
+              <w:spacing w:after="0" w:before="0"/>
+            </w:pPr>
+            <w:r/>
+            <w:r>
+              <w:rPr>
+                <w:rFonts w:ascii="Aptos" w:hAnsi="Aptos"/>
+                <w:b w:val="0"/>
+                <w:color w:val="26384A"/>
+                <w:sz w:val="16"/>
+              </w:rPr>
+              <w:t>Weekly actual audit contributions</w:t>
+            </w:r>
+          </w:p>
+        </w:tc>
+        <w:tc>
+          <w:tcPr>
+            <w:tcW w:type="dxa" w:w="6946"/>
+            <w:vAlign w:val="center"/>
+          </w:tcPr>
+          <w:p>
+            <w:pPr>
+              <w:spacing w:after="0" w:before="0"/>
+            </w:pPr>
+            <w:r/>
+            <w:r>
+              <w:rPr>
+                <w:rFonts w:ascii="Aptos" w:hAnsi="Aptos"/>
+                <w:b w:val="0"/>
+                <w:color w:val="26384A"/>
+                <w:sz w:val="16"/>
+              </w:rPr>
+              <w:t>SSP and employee-days contribute 1 for the first distinct identity/key and 0 for duplicate rows; retailer visits contribute 1 per Q.2 row; order count contributes 1 for the first qualifying Type ID per week; amount contributes Basic Order Value per qualifying row. AOV exports both amount and unique retailer contributions.</w:t>
             </w:r>
           </w:p>
         </w:tc>
@@ -4110,7 +4225,7 @@
                 <w:color w:val="26384A"/>
                 <w:sz w:val="16"/>
               </w:rPr>
-              <w:t>Entered by a user per week; blank is Pending. Not computed from Check-In.</w:t>
+              <w:t>Entered by a user per week; blank is Pending. Exports have no Check-In source row.</w:t>
             </w:r>
           </w:p>
         </w:tc>

</xml_diff>